<commit_message>
fix_code + làm thêm lab1
</commit_message>
<xml_diff>
--- a/mars_mips/lab1/LAB01_M3.docx
+++ b/mars_mips/lab1/LAB01_M3.docx
@@ -13665,7 +13665,6 @@
               <w:keepNext/>
               <w:spacing w:after="60"/>
             </w:pPr>
-            <w:bookmarkStart w:id="0" w:name="_GoBack"/>
             <w:r>
               <w:rPr>
                 <w:b/>
@@ -13928,7 +13927,6 @@
               </w:rPr>
               <w:t xml:space="preserve"> đã dùng.</w:t>
             </w:r>
-            <w:bookmarkEnd w:id="0"/>
           </w:p>
         </w:tc>
       </w:tr>
@@ -17123,9 +17121,19 @@
               <w:keepNext/>
               <w:spacing w:line="252" w:lineRule="auto"/>
               <w:rPr>
-                <w:color w:val="FF0000"/>
-              </w:rPr>
-            </w:pPr>
+                <w:rFonts w:hint="default"/>
+                <w:color w:val="FF0000"/>
+                <w:lang w:val="en-US"/>
+              </w:rPr>
+            </w:pPr>
+            <w:r>
+              <w:rPr>
+                <w:rFonts w:hint="default"/>
+                <w:color w:val="FF0000"/>
+                <w:lang w:val="en-US"/>
+              </w:rPr>
+              <w:t>49200</w:t>
+            </w:r>
           </w:p>
         </w:tc>
         <w:tc>
@@ -17151,9 +17159,19 @@
               <w:keepNext/>
               <w:spacing w:line="252" w:lineRule="auto"/>
               <w:rPr>
-                <w:color w:val="FF0000"/>
-              </w:rPr>
-            </w:pPr>
+                <w:rFonts w:hint="default"/>
+                <w:color w:val="FF0000"/>
+                <w:lang w:val="en-US"/>
+              </w:rPr>
+            </w:pPr>
+            <w:r>
+              <w:rPr>
+                <w:rFonts w:hint="default"/>
+                <w:color w:val="FF0000"/>
+                <w:lang w:val="en-US"/>
+              </w:rPr>
+              <w:t>49200</w:t>
+            </w:r>
           </w:p>
         </w:tc>
         <w:tc>
@@ -17179,9 +17197,19 @@
               <w:keepNext/>
               <w:spacing w:line="252" w:lineRule="auto"/>
               <w:rPr>
-                <w:color w:val="FF0000"/>
-              </w:rPr>
-            </w:pPr>
+                <w:rFonts w:hint="default"/>
+                <w:color w:val="FF0000"/>
+                <w:lang w:val="en-US"/>
+              </w:rPr>
+            </w:pPr>
+            <w:r>
+              <w:rPr>
+                <w:rFonts w:hint="default"/>
+                <w:color w:val="FF0000"/>
+                <w:lang w:val="en-US"/>
+              </w:rPr>
+              <w:t>khớp</w:t>
+            </w:r>
           </w:p>
         </w:tc>
       </w:tr>
@@ -17261,9 +17289,19 @@
               <w:keepNext/>
               <w:spacing w:line="252" w:lineRule="auto"/>
               <w:rPr>
-                <w:color w:val="FF0000"/>
-              </w:rPr>
-            </w:pPr>
+                <w:rFonts w:hint="default"/>
+                <w:color w:val="FF0000"/>
+                <w:lang w:val="en-US"/>
+              </w:rPr>
+            </w:pPr>
+            <w:r>
+              <w:rPr>
+                <w:rFonts w:hint="default"/>
+                <w:color w:val="FF0000"/>
+                <w:lang w:val="en-US"/>
+              </w:rPr>
+              <w:t>82000</w:t>
+            </w:r>
           </w:p>
         </w:tc>
         <w:tc>
@@ -17289,9 +17327,19 @@
               <w:keepNext/>
               <w:spacing w:line="252" w:lineRule="auto"/>
               <w:rPr>
-                <w:color w:val="FF0000"/>
-              </w:rPr>
-            </w:pPr>
+                <w:rFonts w:hint="default"/>
+                <w:color w:val="FF0000"/>
+                <w:lang w:val="en-US"/>
+              </w:rPr>
+            </w:pPr>
+            <w:r>
+              <w:rPr>
+                <w:rFonts w:hint="default"/>
+                <w:color w:val="FF0000"/>
+                <w:lang w:val="en-US"/>
+              </w:rPr>
+              <w:t>82000</w:t>
+            </w:r>
           </w:p>
         </w:tc>
         <w:tc>
@@ -17317,9 +17365,19 @@
               <w:keepNext/>
               <w:spacing w:line="252" w:lineRule="auto"/>
               <w:rPr>
-                <w:color w:val="FF0000"/>
-              </w:rPr>
-            </w:pPr>
+                <w:rFonts w:hint="default"/>
+                <w:color w:val="FF0000"/>
+                <w:lang w:val="en-US"/>
+              </w:rPr>
+            </w:pPr>
+            <w:r>
+              <w:rPr>
+                <w:rFonts w:hint="default"/>
+                <w:color w:val="FF0000"/>
+                <w:lang w:val="en-US"/>
+              </w:rPr>
+              <w:t>khớp</w:t>
+            </w:r>
           </w:p>
         </w:tc>
       </w:tr>
@@ -17399,9 +17457,19 @@
               <w:keepNext/>
               <w:spacing w:line="252" w:lineRule="auto"/>
               <w:rPr>
-                <w:color w:val="FF0000"/>
-              </w:rPr>
-            </w:pPr>
+                <w:rFonts w:hint="default"/>
+                <w:color w:val="FF0000"/>
+                <w:lang w:val="en-US"/>
+              </w:rPr>
+            </w:pPr>
+            <w:r>
+              <w:rPr>
+                <w:rFonts w:hint="default"/>
+                <w:color w:val="FF0000"/>
+                <w:lang w:val="en-US"/>
+              </w:rPr>
+              <w:t>83700</w:t>
+            </w:r>
           </w:p>
         </w:tc>
         <w:tc>
@@ -17427,9 +17495,19 @@
               <w:keepNext/>
               <w:spacing w:line="252" w:lineRule="auto"/>
               <w:rPr>
-                <w:color w:val="FF0000"/>
-              </w:rPr>
-            </w:pPr>
+                <w:rFonts w:hint="default"/>
+                <w:color w:val="FF0000"/>
+                <w:lang w:val="en-US"/>
+              </w:rPr>
+            </w:pPr>
+            <w:r>
+              <w:rPr>
+                <w:rFonts w:hint="default"/>
+                <w:color w:val="FF0000"/>
+                <w:lang w:val="en-US"/>
+              </w:rPr>
+              <w:t>83700</w:t>
+            </w:r>
           </w:p>
         </w:tc>
         <w:tc>
@@ -17455,9 +17533,19 @@
               <w:keepNext/>
               <w:spacing w:line="252" w:lineRule="auto"/>
               <w:rPr>
-                <w:color w:val="FF0000"/>
-              </w:rPr>
-            </w:pPr>
+                <w:rFonts w:hint="default"/>
+                <w:color w:val="FF0000"/>
+                <w:lang w:val="en-US"/>
+              </w:rPr>
+            </w:pPr>
+            <w:r>
+              <w:rPr>
+                <w:rFonts w:hint="default"/>
+                <w:color w:val="FF0000"/>
+                <w:lang w:val="en-US"/>
+              </w:rPr>
+              <w:t>khớp</w:t>
+            </w:r>
           </w:p>
         </w:tc>
       </w:tr>
@@ -17537,9 +17625,19 @@
               <w:keepNext/>
               <w:spacing w:line="252" w:lineRule="auto"/>
               <w:rPr>
-                <w:color w:val="FF0000"/>
-              </w:rPr>
-            </w:pPr>
+                <w:rFonts w:hint="default"/>
+                <w:color w:val="FF0000"/>
+                <w:lang w:val="en-US"/>
+              </w:rPr>
+            </w:pPr>
+            <w:r>
+              <w:rPr>
+                <w:rFonts w:hint="default"/>
+                <w:color w:val="FF0000"/>
+                <w:lang w:val="en-US"/>
+              </w:rPr>
+              <w:t>206800</w:t>
+            </w:r>
           </w:p>
         </w:tc>
         <w:tc>
@@ -17565,9 +17663,19 @@
               <w:keepNext/>
               <w:spacing w:line="252" w:lineRule="auto"/>
               <w:rPr>
-                <w:color w:val="FF0000"/>
-              </w:rPr>
-            </w:pPr>
+                <w:rFonts w:hint="default"/>
+                <w:color w:val="FF0000"/>
+                <w:lang w:val="en-US"/>
+              </w:rPr>
+            </w:pPr>
+            <w:r>
+              <w:rPr>
+                <w:rFonts w:hint="default"/>
+                <w:color w:val="FF0000"/>
+                <w:lang w:val="en-US"/>
+              </w:rPr>
+              <w:t>206800</w:t>
+            </w:r>
           </w:p>
         </w:tc>
         <w:tc>
@@ -17593,9 +17701,19 @@
               <w:keepNext/>
               <w:spacing w:line="252" w:lineRule="auto"/>
               <w:rPr>
-                <w:color w:val="FF0000"/>
-              </w:rPr>
-            </w:pPr>
+                <w:rFonts w:hint="default"/>
+                <w:color w:val="FF0000"/>
+                <w:lang w:val="en-US"/>
+              </w:rPr>
+            </w:pPr>
+            <w:r>
+              <w:rPr>
+                <w:rFonts w:hint="default"/>
+                <w:color w:val="FF0000"/>
+                <w:lang w:val="en-US"/>
+              </w:rPr>
+              <w:t>khớp</w:t>
+            </w:r>
           </w:p>
         </w:tc>
       </w:tr>
@@ -17675,9 +17793,19 @@
               <w:keepNext/>
               <w:spacing w:line="252" w:lineRule="auto"/>
               <w:rPr>
-                <w:color w:val="FF0000"/>
-              </w:rPr>
-            </w:pPr>
+                <w:rFonts w:hint="default"/>
+                <w:color w:val="FF0000"/>
+                <w:lang w:val="en-US"/>
+              </w:rPr>
+            </w:pPr>
+            <w:r>
+              <w:rPr>
+                <w:rFonts w:hint="default"/>
+                <w:color w:val="FF0000"/>
+                <w:lang w:val="en-US"/>
+              </w:rPr>
+              <w:t>493000</w:t>
+            </w:r>
           </w:p>
         </w:tc>
         <w:tc>
@@ -17703,9 +17831,19 @@
               <w:keepNext/>
               <w:spacing w:line="252" w:lineRule="auto"/>
               <w:rPr>
-                <w:color w:val="FF0000"/>
-              </w:rPr>
-            </w:pPr>
+                <w:rFonts w:hint="default"/>
+                <w:color w:val="FF0000"/>
+                <w:lang w:val="en-US"/>
+              </w:rPr>
+            </w:pPr>
+            <w:r>
+              <w:rPr>
+                <w:rFonts w:hint="default"/>
+                <w:color w:val="FF0000"/>
+                <w:lang w:val="en-US"/>
+              </w:rPr>
+              <w:t>49300</w:t>
+            </w:r>
           </w:p>
         </w:tc>
         <w:tc>
@@ -17731,9 +17869,19 @@
               <w:keepNext/>
               <w:spacing w:line="252" w:lineRule="auto"/>
               <w:rPr>
-                <w:color w:val="FF0000"/>
-              </w:rPr>
-            </w:pPr>
+                <w:rFonts w:hint="default"/>
+                <w:color w:val="FF0000"/>
+                <w:lang w:val="en-US"/>
+              </w:rPr>
+            </w:pPr>
+            <w:r>
+              <w:rPr>
+                <w:rFonts w:hint="default"/>
+                <w:color w:val="FF0000"/>
+                <w:lang w:val="en-US"/>
+              </w:rPr>
+              <w:t>khớp</w:t>
+            </w:r>
           </w:p>
         </w:tc>
       </w:tr>
@@ -17813,9 +17961,19 @@
               <w:keepNext/>
               <w:spacing w:line="252" w:lineRule="auto"/>
               <w:rPr>
-                <w:color w:val="FF0000"/>
-              </w:rPr>
-            </w:pPr>
+                <w:rFonts w:hint="default"/>
+                <w:color w:val="FF0000"/>
+                <w:lang w:val="en-US"/>
+              </w:rPr>
+            </w:pPr>
+            <w:r>
+              <w:rPr>
+                <w:rFonts w:hint="default"/>
+                <w:color w:val="FF0000"/>
+                <w:lang w:val="en-US"/>
+              </w:rPr>
+              <w:t>912040</w:t>
+            </w:r>
           </w:p>
         </w:tc>
         <w:tc>
@@ -17841,9 +17999,19 @@
               <w:keepNext/>
               <w:spacing w:line="252" w:lineRule="auto"/>
               <w:rPr>
-                <w:color w:val="FF0000"/>
-              </w:rPr>
-            </w:pPr>
+                <w:rFonts w:hint="default"/>
+                <w:color w:val="FF0000"/>
+                <w:lang w:val="en-US"/>
+              </w:rPr>
+            </w:pPr>
+            <w:r>
+              <w:rPr>
+                <w:rFonts w:hint="default"/>
+                <w:color w:val="FF0000"/>
+                <w:lang w:val="en-US"/>
+              </w:rPr>
+              <w:t>912040</w:t>
+            </w:r>
           </w:p>
         </w:tc>
         <w:tc>
@@ -17869,9 +18037,19 @@
               <w:keepNext/>
               <w:spacing w:line="252" w:lineRule="auto"/>
               <w:rPr>
-                <w:color w:val="FF0000"/>
-              </w:rPr>
-            </w:pPr>
+                <w:rFonts w:hint="default"/>
+                <w:color w:val="FF0000"/>
+                <w:lang w:val="en-US"/>
+              </w:rPr>
+            </w:pPr>
+            <w:r>
+              <w:rPr>
+                <w:rFonts w:hint="default"/>
+                <w:color w:val="FF0000"/>
+                <w:lang w:val="en-US"/>
+              </w:rPr>
+              <w:t>khớp</w:t>
+            </w:r>
           </w:p>
         </w:tc>
       </w:tr>
@@ -17917,13 +18095,26 @@
             <w:pPr>
               <w:spacing w:line="252" w:lineRule="auto"/>
               <w:jc w:val="center"/>
-            </w:pPr>
-            <w:r>
-              <w:rPr>
-                <w:sz w:val="22"/>
-                <w:szCs w:val="22"/>
-              </w:rPr>
-              <w:t>x_b = ......</w:t>
+              <w:rPr>
+                <w:rFonts w:hint="default"/>
+                <w:lang w:val="en-US"/>
+              </w:rPr>
+            </w:pPr>
+            <w:r>
+              <w:rPr>
+                <w:sz w:val="22"/>
+                <w:szCs w:val="22"/>
+              </w:rPr>
+              <w:t xml:space="preserve">x_b = </w:t>
+            </w:r>
+            <w:r>
+              <w:rPr>
+                <w:rFonts w:hint="default"/>
+                <w:sz w:val="22"/>
+                <w:szCs w:val="22"/>
+                <w:lang w:val="en-US"/>
+              </w:rPr>
+              <w:t>7</w:t>
             </w:r>
           </w:p>
         </w:tc>
@@ -17949,9 +18140,19 @@
             <w:pPr>
               <w:spacing w:line="252" w:lineRule="auto"/>
               <w:rPr>
-                <w:color w:val="FF0000"/>
-              </w:rPr>
-            </w:pPr>
+                <w:rFonts w:hint="default"/>
+                <w:color w:val="FF0000"/>
+                <w:lang w:val="en-US"/>
+              </w:rPr>
+            </w:pPr>
+            <w:r>
+              <w:rPr>
+                <w:rFonts w:hint="default"/>
+                <w:color w:val="FF0000"/>
+                <w:lang w:val="en-US"/>
+              </w:rPr>
+              <w:t>11480</w:t>
+            </w:r>
           </w:p>
         </w:tc>
         <w:tc>
@@ -17976,9 +18177,19 @@
             <w:pPr>
               <w:spacing w:line="252" w:lineRule="auto"/>
               <w:rPr>
-                <w:color w:val="FF0000"/>
-              </w:rPr>
-            </w:pPr>
+                <w:rFonts w:hint="default"/>
+                <w:color w:val="FF0000"/>
+                <w:lang w:val="en-US"/>
+              </w:rPr>
+            </w:pPr>
+            <w:r>
+              <w:rPr>
+                <w:rFonts w:hint="default"/>
+                <w:color w:val="FF0000"/>
+                <w:lang w:val="en-US"/>
+              </w:rPr>
+              <w:t>11480</w:t>
+            </w:r>
           </w:p>
         </w:tc>
         <w:tc>
@@ -18003,9 +18214,19 @@
             <w:pPr>
               <w:spacing w:line="252" w:lineRule="auto"/>
               <w:rPr>
-                <w:color w:val="FF0000"/>
-              </w:rPr>
-            </w:pPr>
+                <w:rFonts w:hint="default"/>
+                <w:color w:val="FF0000"/>
+                <w:lang w:val="en-US"/>
+              </w:rPr>
+            </w:pPr>
+            <w:r>
+              <w:rPr>
+                <w:rFonts w:hint="default"/>
+                <w:color w:val="FF0000"/>
+                <w:lang w:val="en-US"/>
+              </w:rPr>
+              <w:t>khớp</w:t>
+            </w:r>
           </w:p>
         </w:tc>
       </w:tr>
@@ -18266,9 +18487,19 @@
               <w:keepNext/>
               <w:spacing w:line="252" w:lineRule="auto"/>
               <w:rPr>
-                <w:color w:val="FF0000"/>
-              </w:rPr>
-            </w:pPr>
+                <w:rFonts w:hint="default"/>
+                <w:color w:val="FF0000"/>
+                <w:lang w:val="en-US"/>
+              </w:rPr>
+            </w:pPr>
+            <w:r>
+              <w:rPr>
+                <w:rFonts w:hint="default"/>
+                <w:color w:val="FF0000"/>
+                <w:lang w:val="en-US"/>
+              </w:rPr>
+              <w:t>Hợp lệ -&gt; Tien dien: 0 dong</w:t>
+            </w:r>
           </w:p>
         </w:tc>
         <w:tc>
@@ -18297,6 +18528,14 @@
                 <w:color w:val="FF0000"/>
               </w:rPr>
             </w:pPr>
+            <w:r>
+              <w:rPr>
+                <w:rFonts w:hint="default"/>
+                <w:color w:val="FF0000"/>
+                <w:lang w:val="en-US"/>
+              </w:rPr>
+              <w:t>Tien dien: 0 dong</w:t>
+            </w:r>
           </w:p>
         </w:tc>
       </w:tr>
@@ -18376,9 +18615,19 @@
               <w:keepNext/>
               <w:spacing w:line="252" w:lineRule="auto"/>
               <w:rPr>
-                <w:color w:val="FF0000"/>
-              </w:rPr>
-            </w:pPr>
+                <w:rFonts w:hint="default"/>
+                <w:color w:val="FF0000"/>
+                <w:lang w:val="en-US"/>
+              </w:rPr>
+            </w:pPr>
+            <w:r>
+              <w:rPr>
+                <w:rFonts w:hint="default"/>
+                <w:color w:val="FF0000"/>
+                <w:lang w:val="en-US"/>
+              </w:rPr>
+              <w:t>Hợp lệ -&gt; Tien dien: 30012960 dong</w:t>
+            </w:r>
           </w:p>
         </w:tc>
         <w:tc>
@@ -18404,9 +18653,21 @@
               <w:keepNext/>
               <w:spacing w:line="252" w:lineRule="auto"/>
               <w:rPr>
-                <w:color w:val="FF0000"/>
-              </w:rPr>
-            </w:pPr>
+                <w:rFonts w:hint="default" w:ascii="Times New Roman" w:hAnsi="Times New Roman" w:eastAsia="Times New Roman" w:cs="Times New Roman"/>
+                <w:color w:val="FF0000"/>
+                <w:sz w:val="24"/>
+                <w:szCs w:val="24"/>
+                <w:lang w:val="en-US" w:eastAsia="en-US" w:bidi="ar-SA"/>
+              </w:rPr>
+            </w:pPr>
+            <w:r>
+              <w:rPr>
+                <w:rFonts w:hint="default"/>
+                <w:color w:val="FF0000"/>
+                <w:lang w:val="en-US"/>
+              </w:rPr>
+              <w:t>Tien dien: 30089960 dong</w:t>
+            </w:r>
           </w:p>
         </w:tc>
       </w:tr>
@@ -18486,9 +18747,19 @@
               <w:keepNext/>
               <w:spacing w:line="252" w:lineRule="auto"/>
               <w:rPr>
-                <w:color w:val="FF0000"/>
-              </w:rPr>
-            </w:pPr>
+                <w:rFonts w:hint="default"/>
+                <w:color w:val="FF0000"/>
+                <w:lang w:val="en-US"/>
+              </w:rPr>
+            </w:pPr>
+            <w:r>
+              <w:rPr>
+                <w:rFonts w:hint="default"/>
+                <w:color w:val="FF0000"/>
+                <w:lang w:val="en-US"/>
+              </w:rPr>
+              <w:t>Ko hợp lệ, cho nhập lại</w:t>
+            </w:r>
           </w:p>
         </w:tc>
         <w:tc>
@@ -18514,9 +18785,38 @@
               <w:keepNext/>
               <w:spacing w:line="252" w:lineRule="auto"/>
               <w:rPr>
-                <w:color w:val="FF0000"/>
-              </w:rPr>
-            </w:pPr>
+                <w:rFonts w:hint="default"/>
+                <w:color w:val="FF0000"/>
+                <w:lang w:val="en-US"/>
+              </w:rPr>
+            </w:pPr>
+            <w:r>
+              <w:rPr>
+                <w:rFonts w:hint="default"/>
+                <w:color w:val="FF0000"/>
+                <w:lang w:val="en-US"/>
+              </w:rPr>
+              <w:t>Gia tri khong hop le, nhap lai</w:t>
+            </w:r>
+          </w:p>
+          <w:p>
+            <w:pPr>
+              <w:keepNext/>
+              <w:spacing w:line="252" w:lineRule="auto"/>
+              <w:rPr>
+                <w:rFonts w:hint="default"/>
+                <w:color w:val="FF0000"/>
+                <w:lang w:val="en-US"/>
+              </w:rPr>
+            </w:pPr>
+            <w:r>
+              <w:rPr>
+                <w:rFonts w:hint="default"/>
+                <w:color w:val="FF0000"/>
+                <w:lang w:val="en-US"/>
+              </w:rPr>
+              <w:t>Nhap so kWh (0..9999):</w:t>
+            </w:r>
           </w:p>
         </w:tc>
       </w:tr>
@@ -18594,9 +18894,19 @@
             <w:pPr>
               <w:spacing w:line="252" w:lineRule="auto"/>
               <w:rPr>
-                <w:color w:val="FF0000"/>
-              </w:rPr>
-            </w:pPr>
+                <w:rFonts w:hint="default"/>
+                <w:color w:val="FF0000"/>
+                <w:lang w:val="en-US"/>
+              </w:rPr>
+            </w:pPr>
+            <w:r>
+              <w:rPr>
+                <w:rFonts w:hint="default"/>
+                <w:color w:val="FF0000"/>
+                <w:lang w:val="en-US"/>
+              </w:rPr>
+              <w:t>Ko hợp lệ, cho nhập lại</w:t>
+            </w:r>
           </w:p>
         </w:tc>
         <w:tc>
@@ -18619,11 +18929,38 @@
           </w:tcPr>
           <w:p>
             <w:pPr>
-              <w:spacing w:line="252" w:lineRule="auto"/>
-              <w:rPr>
-                <w:color w:val="FF0000"/>
-              </w:rPr>
-            </w:pPr>
+              <w:keepNext/>
+              <w:spacing w:line="252" w:lineRule="auto"/>
+              <w:rPr>
+                <w:rFonts w:hint="default"/>
+                <w:color w:val="FF0000"/>
+                <w:lang w:val="en-US"/>
+              </w:rPr>
+            </w:pPr>
+            <w:r>
+              <w:rPr>
+                <w:rFonts w:hint="default"/>
+                <w:color w:val="FF0000"/>
+                <w:lang w:val="en-US"/>
+              </w:rPr>
+              <w:t>Gia tri khong hop le, nhap lai</w:t>
+            </w:r>
+          </w:p>
+          <w:p>
+            <w:pPr>
+              <w:spacing w:line="252" w:lineRule="auto"/>
+              <w:rPr>
+                <w:color w:val="FF0000"/>
+              </w:rPr>
+            </w:pPr>
+            <w:r>
+              <w:rPr>
+                <w:rFonts w:hint="default"/>
+                <w:color w:val="FF0000"/>
+                <w:lang w:val="en-US"/>
+              </w:rPr>
+              <w:t>Nhap so kWh (0..9999):</w:t>
+            </w:r>
           </w:p>
         </w:tc>
       </w:tr>
@@ -18724,18 +19061,97 @@
           <w:p>
             <w:pPr>
               <w:rPr>
-                <w:color w:val="FF0000"/>
-              </w:rPr>
-            </w:pPr>
-            <w:r>
-              <w:rPr>
                 <w:i/>
                 <w:iCs/>
                 <w:color w:val="FF0000"/>
                 <w:sz w:val="20"/>
                 <w:szCs w:val="20"/>
               </w:rPr>
+            </w:pPr>
+            <w:r>
+              <w:rPr>
+                <w:i/>
+                <w:iCs/>
+                <w:color w:val="FF0000"/>
+                <w:sz w:val="20"/>
+                <w:szCs w:val="20"/>
+              </w:rPr>
               <w:t>Trả lời:</w:t>
+            </w:r>
+          </w:p>
+          <w:p>
+            <w:pPr>
+              <w:rPr>
+                <w:rFonts w:hint="default"/>
+                <w:i/>
+                <w:iCs/>
+                <w:color w:val="FF0000"/>
+                <w:sz w:val="20"/>
+                <w:szCs w:val="20"/>
+                <w:lang w:val="en-US"/>
+              </w:rPr>
+            </w:pPr>
+            <w:r>
+              <w:rPr>
+                <w:rFonts w:hint="default"/>
+                <w:i/>
+                <w:iCs/>
+                <w:color w:val="FF0000"/>
+                <w:sz w:val="20"/>
+                <w:szCs w:val="20"/>
+                <w:lang w:val="en-US"/>
+              </w:rPr>
+              <w:t>- lệnh so sánh: sltiu $t3, $s0, 10000</w:t>
+            </w:r>
+          </w:p>
+          <w:p>
+            <w:pPr>
+              <w:rPr>
+                <w:rFonts w:hint="default"/>
+                <w:i/>
+                <w:iCs/>
+                <w:color w:val="FF0000"/>
+                <w:sz w:val="20"/>
+                <w:szCs w:val="20"/>
+                <w:lang w:val="en-US"/>
+              </w:rPr>
+            </w:pPr>
+            <w:r>
+              <w:rPr>
+                <w:rFonts w:hint="default"/>
+                <w:i/>
+                <w:iCs/>
+                <w:color w:val="FF0000"/>
+                <w:sz w:val="20"/>
+                <w:szCs w:val="20"/>
+                <w:lang w:val="en-US"/>
+              </w:rPr>
+              <w:t>- lệnh nhánh: beq $t3, $zero, NhapLai</w:t>
+            </w:r>
+          </w:p>
+          <w:p>
+            <w:pPr>
+              <w:rPr>
+                <w:rFonts w:hint="default"/>
+                <w:i/>
+                <w:iCs/>
+                <w:color w:val="FF0000"/>
+                <w:sz w:val="20"/>
+                <w:szCs w:val="20"/>
+                <w:lang w:val="en-US"/>
+              </w:rPr>
+            </w:pPr>
+            <w:r>
+              <w:rPr>
+                <w:rFonts w:hint="default"/>
+                <w:i/>
+                <w:iCs/>
+                <w:color w:val="FF0000"/>
+                <w:sz w:val="20"/>
+                <w:szCs w:val="20"/>
+                <w:lang w:val="en-US"/>
+              </w:rPr>
+              <w:t>--&gt; khi x &lt; 0 thì bit 31 của nó là 1, nó sẽ ở dạng số rất lớn khi ở phép so sánh ko dấu (bit số 31 là 1 thì --&gt; 2^31, rất lớn &gt;= 10000), còn khi x &gt;= 10000 ở dạng ko dấu thì bản chất đúng là nó &gt;= 10000.</w:t>
             </w:r>
           </w:p>
         </w:tc>
@@ -18789,7 +19205,12 @@
         <w:t xml:space="preserve"> DỰ ĐOÁN </w:t>
       </w:r>
       <w:r>
-        <w:t xml:space="preserve">  Chương trình sẽ làm gì? Ghi dự đoán trước, rồi chạy và ghi quan sát. Sau khi xong, khôi phục lệnh đúng.</w:t>
+        <w:t xml:space="preserve">  Chương trình sẽ làm gì? G</w:t>
+      </w:r>
+      <w:bookmarkStart w:id="0" w:name="_GoBack"/>
+      <w:bookmarkEnd w:id="0"/>
+      <w:r>
+        <w:t>hi dự đoán trước, rồi chạy và ghi quan sát. Sau khi xong, khôi phục lệnh đúng.</w:t>
       </w:r>
     </w:p>
     <w:tbl>
@@ -29327,7 +29748,7 @@
   <w:docDefaults>
     <w:rPrDefault>
       <w:rPr>
-        <w:rFonts w:ascii="Times New Roman" w:hAnsi="Times New Roman" w:eastAsia="Times New Roman" w:cs="Times New Roman"/>
+        <w:rFonts w:ascii="Times New Roman" w:hAnsi="Times New Roman" w:eastAsia="SimSun" w:cs="Times New Roman"/>
       </w:rPr>
     </w:rPrDefault>
     <w:pPrDefault/>

</xml_diff>